<commit_message>
Remove recommended price, add coding to value list and Scratch for 10+
All 12 languages: printed price paragraph removed (price note for the typesetter only), coding opens the base-kit list, age table extended to 10+ with a Scratch line, intro extended beyond age 10. All four formats regenerated.

Co-Authored-By: Claude Opus 4.8 <noreply@anthropic.com>
</commit_message>
<xml_diff>
--- a/de/catalogue.docx
+++ b/de/catalogue.docx
@@ -5,7 +5,7 @@
     <w:p>
       <w:pPr>
         <w:pStyle w:val="note"/>
-        <w:divId w:val="525214978"/>
+        <w:divId w:val="1275867849"/>
         <w:rPr>
           <w:rFonts w:ascii="Segoe UI" w:hAnsi="Segoe UI" w:cs="Segoe UI"/>
           <w:lang w:val="de-DE"/>
@@ -25,7 +25,7 @@
     <w:p>
       <w:pPr>
         <w:pStyle w:val="note"/>
-        <w:divId w:val="525214978"/>
+        <w:divId w:val="1275867849"/>
         <w:rPr>
           <w:rFonts w:ascii="Segoe UI" w:hAnsi="Segoe UI" w:cs="Segoe UI"/>
           <w:lang w:val="de-DE"/>
@@ -45,7 +45,7 @@
     <w:p>
       <w:pPr>
         <w:pStyle w:val="1"/>
-        <w:divId w:val="525214978"/>
+        <w:divId w:val="1275867849"/>
         <w:rPr>
           <w:rFonts w:ascii="Segoe UI" w:eastAsia="Times New Roman" w:hAnsi="Segoe UI" w:cs="Segoe UI"/>
           <w:lang w:val="de-DE"/>
@@ -62,7 +62,7 @@
     <w:p>
       <w:pPr>
         <w:pStyle w:val="2"/>
-        <w:divId w:val="525214978"/>
+        <w:divId w:val="1275867849"/>
         <w:rPr>
           <w:rFonts w:ascii="Segoe UI" w:eastAsia="Times New Roman" w:hAnsi="Segoe UI" w:cs="Segoe UI"/>
           <w:lang w:val="de-DE"/>
@@ -79,7 +79,7 @@
     <w:p>
       <w:pPr>
         <w:pStyle w:val="note"/>
-        <w:divId w:val="525214978"/>
+        <w:divId w:val="1275867849"/>
         <w:rPr>
           <w:rFonts w:ascii="Segoe UI" w:hAnsi="Segoe UI" w:cs="Segoe UI"/>
           <w:lang w:val="de-DE"/>
@@ -109,7 +109,7 @@
     <w:p>
       <w:pPr>
         <w:pStyle w:val="a7"/>
-        <w:divId w:val="525214978"/>
+        <w:divId w:val="1275867849"/>
         <w:rPr>
           <w:rFonts w:ascii="Segoe UI" w:hAnsi="Segoe UI" w:cs="Segoe UI"/>
           <w:color w:val="1C1C1C"/>
@@ -128,34 +128,34 @@
     <w:p>
       <w:pPr>
         <w:pStyle w:val="a7"/>
-        <w:divId w:val="525214978"/>
-        <w:rPr>
-          <w:rFonts w:ascii="Segoe UI" w:hAnsi="Segoe UI" w:cs="Segoe UI"/>
-          <w:color w:val="1C1C1C"/>
-          <w:lang w:val="de-DE"/>
-        </w:rPr>
-      </w:pPr>
-      <w:r>
-        <w:rPr>
-          <w:rFonts w:ascii="Segoe UI" w:hAnsi="Segoe UI" w:cs="Segoe UI"/>
-          <w:color w:val="1C1C1C"/>
-          <w:lang w:val="de-DE"/>
-        </w:rPr>
-        <w:t>Ein einziger Roboter wächst mit dem Kind mit, von 4 bis 10 Jahren. Die Jüngeren lernen Logik und meistern Labyrinthe, die Älteren gehen über zu Winkeln, Geometrie und</w:t>
-      </w:r>
-      <w:r>
-        <w:rPr>
-          <w:rFonts w:ascii="Segoe UI" w:hAnsi="Segoe UI" w:cs="Segoe UI"/>
-          <w:color w:val="1C1C1C"/>
-          <w:lang w:val="de-DE"/>
-        </w:rPr>
-        <w:t xml:space="preserve"> Zeichnen.</w:t>
+        <w:divId w:val="1275867849"/>
+        <w:rPr>
+          <w:rFonts w:ascii="Segoe UI" w:hAnsi="Segoe UI" w:cs="Segoe UI"/>
+          <w:color w:val="1C1C1C"/>
+          <w:lang w:val="de-DE"/>
+        </w:rPr>
+      </w:pPr>
+      <w:r>
+        <w:rPr>
+          <w:rFonts w:ascii="Segoe UI" w:hAnsi="Segoe UI" w:cs="Segoe UI"/>
+          <w:color w:val="1C1C1C"/>
+          <w:lang w:val="de-DE"/>
+        </w:rPr>
+        <w:t>Ein einziger Roboter wächst mit dem Kind mit, von 4 bis 10 Jahren und darüber hinaus. Die Jüngeren lernen Logik und meistern Labyrinthe, die Älteren gehen über zu Win</w:t>
+      </w:r>
+      <w:r>
+        <w:rPr>
+          <w:rFonts w:ascii="Segoe UI" w:hAnsi="Segoe UI" w:cs="Segoe UI"/>
+          <w:color w:val="1C1C1C"/>
+          <w:lang w:val="de-DE"/>
+        </w:rPr>
+        <w:t>keln, Geometrie und Zeichnen.</w:t>
       </w:r>
     </w:p>
     <w:p>
       <w:pPr>
         <w:pStyle w:val="3"/>
-        <w:divId w:val="525214978"/>
+        <w:divId w:val="1275867849"/>
         <w:rPr>
           <w:rFonts w:ascii="Segoe UI" w:eastAsia="Times New Roman" w:hAnsi="Segoe UI" w:cs="Segoe UI"/>
           <w:lang w:val="de-DE"/>
@@ -172,34 +172,34 @@
     <w:p>
       <w:pPr>
         <w:pStyle w:val="a7"/>
-        <w:divId w:val="525214978"/>
-        <w:rPr>
-          <w:rFonts w:ascii="Segoe UI" w:hAnsi="Segoe UI" w:cs="Segoe UI"/>
-          <w:color w:val="1C1C1C"/>
-          <w:lang w:val="de-DE"/>
-        </w:rPr>
-      </w:pPr>
-      <w:r>
-        <w:rPr>
-          <w:rFonts w:ascii="Segoe UI" w:hAnsi="Segoe UI" w:cs="Segoe UI"/>
-          <w:color w:val="1C1C1C"/>
-          <w:lang w:val="de-DE"/>
-        </w:rPr>
-        <w:t xml:space="preserve">Stecken Sie einen Filzstift ein, und der Roboter zeichnet eine Spirale oder eine komplexe Figur auf das Papier, wobei er Winkel und Abstände unterwegs berechnet. Ein gewöhnlicher fahrender Roboter ohne </w:t>
-      </w:r>
-      <w:r>
-        <w:rPr>
-          <w:rFonts w:ascii="Segoe UI" w:hAnsi="Segoe UI" w:cs="Segoe UI"/>
-          <w:color w:val="1C1C1C"/>
-          <w:lang w:val="de-DE"/>
-        </w:rPr>
-        <w:t>Bildschirm schafft diese Präzision nicht. Das Kind sieht das Ergebnis seines Programms direkt auf dem Blatt.</w:t>
+        <w:divId w:val="1275867849"/>
+        <w:rPr>
+          <w:rFonts w:ascii="Segoe UI" w:hAnsi="Segoe UI" w:cs="Segoe UI"/>
+          <w:color w:val="1C1C1C"/>
+          <w:lang w:val="de-DE"/>
+        </w:rPr>
+      </w:pPr>
+      <w:r>
+        <w:rPr>
+          <w:rFonts w:ascii="Segoe UI" w:hAnsi="Segoe UI" w:cs="Segoe UI"/>
+          <w:color w:val="1C1C1C"/>
+          <w:lang w:val="de-DE"/>
+        </w:rPr>
+        <w:t>Stecken Sie einen Filzstift ein, und der Roboter zeichnet eine Spirale oder eine komplexe Figur auf das Papier, wobei er Winkel und Abstände unterwegs berechnet. Ein gewöhnlicher fahr</w:t>
+      </w:r>
+      <w:r>
+        <w:rPr>
+          <w:rFonts w:ascii="Segoe UI" w:hAnsi="Segoe UI" w:cs="Segoe UI"/>
+          <w:color w:val="1C1C1C"/>
+          <w:lang w:val="de-DE"/>
+        </w:rPr>
+        <w:t>ender Roboter ohne Bildschirm schafft diese Präzision nicht. Das Kind sieht das Ergebnis seines Programms direkt auf dem Blatt.</w:t>
       </w:r>
     </w:p>
     <w:p>
       <w:pPr>
         <w:pStyle w:val="3"/>
-        <w:divId w:val="525214978"/>
+        <w:divId w:val="1275867849"/>
         <w:rPr>
           <w:rFonts w:ascii="Segoe UI" w:eastAsia="Times New Roman" w:hAnsi="Segoe UI" w:cs="Segoe UI"/>
           <w:lang w:val="de-DE"/>
@@ -216,34 +216,34 @@
     <w:p>
       <w:pPr>
         <w:pStyle w:val="a7"/>
-        <w:divId w:val="525214978"/>
-        <w:rPr>
-          <w:rFonts w:ascii="Segoe UI" w:hAnsi="Segoe UI" w:cs="Segoe UI"/>
-          <w:color w:val="1C1C1C"/>
-          <w:lang w:val="de-DE"/>
-        </w:rPr>
-      </w:pPr>
-      <w:r>
-        <w:rPr>
-          <w:rFonts w:ascii="Segoe UI" w:hAnsi="Segoe UI" w:cs="Segoe UI"/>
-          <w:color w:val="1C1C1C"/>
-          <w:lang w:val="de-DE"/>
-        </w:rPr>
-        <w:t>Zeichnen, Geometrie, Sprachausgabe und eine fertige Methodik stecken bereits im Grundset. Wo man sonst meh</w:t>
-      </w:r>
-      <w:r>
-        <w:rPr>
-          <w:rFonts w:ascii="Segoe UI" w:hAnsi="Segoe UI" w:cs="Segoe UI"/>
-          <w:color w:val="1C1C1C"/>
-          <w:lang w:val="de-DE"/>
-        </w:rPr>
-        <w:t>rere Roboter für verschiedene Altersstufen braucht oder kostenpflichtige Erweiterungen zu einem dazukauft, deckt hier ein einziger Roboter alles ab. Ein zweites Budget für Nachkäufe ist nicht nötig.</w:t>
+        <w:divId w:val="1275867849"/>
+        <w:rPr>
+          <w:rFonts w:ascii="Segoe UI" w:hAnsi="Segoe UI" w:cs="Segoe UI"/>
+          <w:color w:val="1C1C1C"/>
+          <w:lang w:val="de-DE"/>
+        </w:rPr>
+      </w:pPr>
+      <w:r>
+        <w:rPr>
+          <w:rFonts w:ascii="Segoe UI" w:hAnsi="Segoe UI" w:cs="Segoe UI"/>
+          <w:color w:val="1C1C1C"/>
+          <w:lang w:val="de-DE"/>
+        </w:rPr>
+        <w:t>Programmieren, Zeichnen, Geometrie, Sprachausgabe und eine fertige Methodik stecken ber</w:t>
+      </w:r>
+      <w:r>
+        <w:rPr>
+          <w:rFonts w:ascii="Segoe UI" w:hAnsi="Segoe UI" w:cs="Segoe UI"/>
+          <w:color w:val="1C1C1C"/>
+          <w:lang w:val="de-DE"/>
+        </w:rPr>
+        <w:t>eits im Grundset. Wo man sonst mehrere Roboter für verschiedene Altersstufen braucht oder kostenpflichtige Erweiterungen zu einem dazukauft, deckt hier ein einziger Roboter alles ab. Aufpreise gibt es keine.</w:t>
       </w:r>
     </w:p>
     <w:p>
       <w:pPr>
         <w:pStyle w:val="3"/>
-        <w:divId w:val="525214978"/>
+        <w:divId w:val="1275867849"/>
         <w:rPr>
           <w:rFonts w:ascii="Segoe UI" w:eastAsia="Times New Roman" w:hAnsi="Segoe UI" w:cs="Segoe UI"/>
           <w:lang w:val="de-DE"/>
@@ -260,34 +260,34 @@
     <w:p>
       <w:pPr>
         <w:pStyle w:val="a7"/>
-        <w:divId w:val="525214978"/>
-        <w:rPr>
-          <w:rFonts w:ascii="Segoe UI" w:hAnsi="Segoe UI" w:cs="Segoe UI"/>
-          <w:color w:val="1C1C1C"/>
-          <w:lang w:val="de-DE"/>
-        </w:rPr>
-      </w:pPr>
-      <w:r>
-        <w:rPr>
-          <w:rFonts w:ascii="Segoe UI" w:hAnsi="Segoe UI" w:cs="Segoe UI"/>
-          <w:color w:val="1C1C1C"/>
-          <w:lang w:val="de-DE"/>
-        </w:rPr>
-        <w:t>Der Roboter fährt übe</w:t>
-      </w:r>
-      <w:r>
-        <w:rPr>
-          <w:rFonts w:ascii="Segoe UI" w:hAnsi="Segoe UI" w:cs="Segoe UI"/>
-          <w:color w:val="1C1C1C"/>
-          <w:lang w:val="de-DE"/>
-        </w:rPr>
-        <w:t>r beliebige karierte Karten und Matten: über fertige oder über solche, die Sie selbst ausdrucken oder zeichnen. Es muss nichts Markeneigenes gekauft werden. Die Schrittweite lässt sich auf jede Kästchengröße einstellen, voreingestellt sind 15 cm.</w:t>
+        <w:divId w:val="1275867849"/>
+        <w:rPr>
+          <w:rFonts w:ascii="Segoe UI" w:hAnsi="Segoe UI" w:cs="Segoe UI"/>
+          <w:color w:val="1C1C1C"/>
+          <w:lang w:val="de-DE"/>
+        </w:rPr>
+      </w:pPr>
+      <w:r>
+        <w:rPr>
+          <w:rFonts w:ascii="Segoe UI" w:hAnsi="Segoe UI" w:cs="Segoe UI"/>
+          <w:color w:val="1C1C1C"/>
+          <w:lang w:val="de-DE"/>
+        </w:rPr>
+        <w:t xml:space="preserve">Der Roboter </w:t>
+      </w:r>
+      <w:r>
+        <w:rPr>
+          <w:rFonts w:ascii="Segoe UI" w:hAnsi="Segoe UI" w:cs="Segoe UI"/>
+          <w:color w:val="1C1C1C"/>
+          <w:lang w:val="de-DE"/>
+        </w:rPr>
+        <w:t>fährt über beliebige karierte Karten und Matten: über fertige oder über solche, die Sie selbst ausdrucken oder zeichnen. Es muss nichts Markeneigenes gekauft werden. Die Schrittweite lässt sich auf jede Kästchengröße einstellen, voreingestellt sind 15 cm.</w:t>
       </w:r>
     </w:p>
     <w:p>
       <w:pPr>
         <w:pStyle w:val="note"/>
-        <w:divId w:val="525214978"/>
+        <w:divId w:val="1275867849"/>
         <w:rPr>
           <w:rFonts w:ascii="Segoe UI" w:hAnsi="Segoe UI" w:cs="Segoe UI"/>
           <w:lang w:val="de-DE"/>
@@ -301,8 +301,311 @@
           <w:iCs/>
           <w:lang w:val="de-DE"/>
         </w:rPr>
-        <w:t>[Foto: as</w:t>
-      </w:r>
+        <w:t>[Foto: assets/photos/02-robot-sur-quadrillage.jpg, Roboter auf dem Raster]</w:t>
+      </w:r>
+    </w:p>
+    <w:p>
+      <w:pPr>
+        <w:pStyle w:val="3"/>
+        <w:divId w:val="1275867849"/>
+        <w:rPr>
+          <w:rFonts w:ascii="Segoe UI" w:eastAsia="Times New Roman" w:hAnsi="Segoe UI" w:cs="Segoe UI"/>
+          <w:lang w:val="de-DE"/>
+        </w:rPr>
+      </w:pPr>
+      <w:r>
+        <w:rPr>
+          <w:rFonts w:ascii="Segoe UI" w:eastAsia="Times New Roman" w:hAnsi="Segoe UI" w:cs="Segoe UI"/>
+          <w:lang w:val="de-DE"/>
+        </w:rPr>
+        <w:t>Methodik und Unterrichtsentwürfe sind bereits dabei</w:t>
+      </w:r>
+    </w:p>
+    <w:p>
+      <w:pPr>
+        <w:pStyle w:val="a7"/>
+        <w:divId w:val="1275867849"/>
+        <w:rPr>
+          <w:rFonts w:ascii="Segoe UI" w:hAnsi="Segoe UI" w:cs="Segoe UI"/>
+          <w:color w:val="1C1C1C"/>
+          <w:lang w:val="de-DE"/>
+        </w:rPr>
+      </w:pPr>
+      <w:r>
+        <w:rPr>
+          <w:rFonts w:ascii="Segoe UI" w:hAnsi="Segoe UI" w:cs="Segoe UI"/>
+          <w:color w:val="1C1C1C"/>
+          <w:lang w:val="de-DE"/>
+        </w:rPr>
+        <w:t>Ein fertiger Kurs führt vom ersten Programm über Funktionen, Schleifen, Abstände und Winkel bis hin zur Arithmetik. Eigens für di</w:t>
+      </w:r>
+      <w:r>
+        <w:rPr>
+          <w:rFonts w:ascii="Segoe UI" w:hAnsi="Segoe UI" w:cs="Segoe UI"/>
+          <w:color w:val="1C1C1C"/>
+          <w:lang w:val="de-DE"/>
+        </w:rPr>
+        <w:t>e Jüngeren von 4-8 Jahren gibt es einen Einführungskurs aus 12 Einheiten. Alles ist in der Dokumentation offen einsehbar, schon vor der Bestellung. Ein Set für eine Gruppe von 2-4 Kindern: Roboter, Holzkonsole und Befehlskarten aus Pappe. Das Programm baue</w:t>
+      </w:r>
+      <w:r>
+        <w:rPr>
+          <w:rFonts w:ascii="Segoe UI" w:hAnsi="Segoe UI" w:cs="Segoe UI"/>
+          <w:color w:val="1C1C1C"/>
+          <w:lang w:val="de-DE"/>
+        </w:rPr>
+        <w:t>n die Kinder mit den Händen direkt auf der Konsole zusammen.</w:t>
+      </w:r>
+    </w:p>
+    <w:p>
+      <w:pPr>
+        <w:pStyle w:val="3"/>
+        <w:divId w:val="1275867849"/>
+        <w:rPr>
+          <w:rFonts w:ascii="Segoe UI" w:eastAsia="Times New Roman" w:hAnsi="Segoe UI" w:cs="Segoe UI"/>
+          <w:lang w:val="de-DE"/>
+        </w:rPr>
+      </w:pPr>
+      <w:r>
+        <w:rPr>
+          <w:rFonts w:ascii="Segoe UI" w:eastAsia="Times New Roman" w:hAnsi="Segoe UI" w:cs="Segoe UI"/>
+          <w:lang w:val="de-DE"/>
+        </w:rPr>
+        <w:t>Den Fehler findet das Kind selbst</w:t>
+      </w:r>
+    </w:p>
+    <w:p>
+      <w:pPr>
+        <w:pStyle w:val="a7"/>
+        <w:divId w:val="1275867849"/>
+        <w:rPr>
+          <w:rFonts w:ascii="Segoe UI" w:hAnsi="Segoe UI" w:cs="Segoe UI"/>
+          <w:color w:val="1C1C1C"/>
+          <w:lang w:val="de-DE"/>
+        </w:rPr>
+      </w:pPr>
+      <w:r>
+        <w:rPr>
+          <w:rFonts w:ascii="Segoe UI" w:hAnsi="Segoe UI" w:cs="Segoe UI"/>
+          <w:color w:val="1C1C1C"/>
+          <w:lang w:val="de-DE"/>
+        </w:rPr>
+        <w:t>Das Programm bleibt auf der Konsole, vor den Augen des Kindes. Fährt der Roboter in die falsche Richtung oder wird die Linie krumm, findet das Kind selbst den fa</w:t>
+      </w:r>
+      <w:r>
+        <w:rPr>
+          <w:rFonts w:ascii="Segoe UI" w:hAnsi="Segoe UI" w:cs="Segoe UI"/>
+          <w:color w:val="1C1C1C"/>
+          <w:lang w:val="de-DE"/>
+        </w:rPr>
+        <w:t>lschen Schritt, ändert einen Teil des Programms und versucht es erneut. Mit dem Filzstift ist das noch anschaulicher: Der Fehler ist sofort auf dem Papier zu sehen.</w:t>
+      </w:r>
+    </w:p>
+    <w:p>
+      <w:pPr>
+        <w:pStyle w:val="3"/>
+        <w:divId w:val="1275867849"/>
+        <w:rPr>
+          <w:rFonts w:ascii="Segoe UI" w:eastAsia="Times New Roman" w:hAnsi="Segoe UI" w:cs="Segoe UI"/>
+          <w:lang w:val="de-DE"/>
+        </w:rPr>
+      </w:pPr>
+      <w:r>
+        <w:rPr>
+          <w:rFonts w:ascii="Segoe UI" w:eastAsia="Times New Roman" w:hAnsi="Segoe UI" w:cs="Segoe UI"/>
+          <w:lang w:val="de-DE"/>
+        </w:rPr>
+        <w:t>Buchstaben, Wörter und Musik</w:t>
+      </w:r>
+    </w:p>
+    <w:p>
+      <w:pPr>
+        <w:pStyle w:val="a7"/>
+        <w:divId w:val="1275867849"/>
+        <w:rPr>
+          <w:rFonts w:ascii="Segoe UI" w:hAnsi="Segoe UI" w:cs="Segoe UI"/>
+          <w:color w:val="1C1C1C"/>
+          <w:lang w:val="de-DE"/>
+        </w:rPr>
+      </w:pPr>
+      <w:r>
+        <w:rPr>
+          <w:rFonts w:ascii="Segoe UI" w:hAnsi="Segoe UI" w:cs="Segoe UI"/>
+          <w:color w:val="1C1C1C"/>
+          <w:lang w:val="de-DE"/>
+        </w:rPr>
+        <w:t xml:space="preserve">Der Roboter spricht jeden Schritt und jeden Befehl mit Stimme </w:t>
+      </w:r>
+      <w:r>
+        <w:rPr>
+          <w:rFonts w:ascii="Segoe UI" w:hAnsi="Segoe UI" w:cs="Segoe UI"/>
+          <w:color w:val="1C1C1C"/>
+          <w:lang w:val="de-DE"/>
+        </w:rPr>
+        <w:t xml:space="preserve">aus, in der von Ihnen gewählten Sprache. Die Sprachausgabe ist in mehr als 17 Sprachen verfügbar. Er fährt auf eine Karte mit einem Wort und spricht es aus. Insgesamt rund 90 Wörter: Haus, Wald, Kino. Er nennt die Buchstaben des Alphabets, spielt Noten ab </w:t>
+      </w:r>
+      <w:r>
+        <w:rPr>
+          <w:rFonts w:ascii="Segoe UI" w:hAnsi="Segoe UI" w:cs="Segoe UI"/>
+          <w:color w:val="1C1C1C"/>
+          <w:lang w:val="de-DE"/>
+        </w:rPr>
+        <w:t>und spricht Rechenaufgaben vor. Derselbe Roboter, der das Programmieren und Rechnen lehrt, macht nebenbei mit Sprache und Musik vertraut.</w:t>
+      </w:r>
+    </w:p>
+    <w:p>
+      <w:pPr>
+        <w:pStyle w:val="3"/>
+        <w:divId w:val="1275867849"/>
+        <w:rPr>
+          <w:rFonts w:ascii="Segoe UI" w:eastAsia="Times New Roman" w:hAnsi="Segoe UI" w:cs="Segoe UI"/>
+          <w:lang w:val="de-DE"/>
+        </w:rPr>
+      </w:pPr>
+      <w:r>
+        <w:rPr>
+          <w:rFonts w:ascii="Segoe UI" w:eastAsia="Times New Roman" w:hAnsi="Segoe UI" w:cs="Segoe UI"/>
+          <w:lang w:val="de-DE"/>
+        </w:rPr>
+        <w:t>Von 4 bis 10+, ein Roboter</w:t>
+      </w:r>
+    </w:p>
+    <w:p>
+      <w:pPr>
+        <w:pStyle w:val="a7"/>
+        <w:divId w:val="1275867849"/>
+        <w:rPr>
+          <w:rFonts w:ascii="Segoe UI" w:hAnsi="Segoe UI" w:cs="Segoe UI"/>
+          <w:color w:val="1C1C1C"/>
+          <w:lang w:val="de-DE"/>
+        </w:rPr>
+      </w:pPr>
+      <w:r>
+        <w:rPr>
+          <w:rFonts w:ascii="Segoe UI" w:hAnsi="Segoe UI" w:cs="Segoe UI"/>
+          <w:color w:val="1C1C1C"/>
+          <w:lang w:val="de-DE"/>
+        </w:rPr>
+        <w:t>4-7 Jahre (untere Grundschulklassen): Bewegungen und Drehungen, Labyrinthe, Abfolgen, Schle</w:t>
+      </w:r>
+      <w:r>
+        <w:rPr>
+          <w:rFonts w:ascii="Segoe UI" w:hAnsi="Segoe UI" w:cs="Segoe UI"/>
+          <w:color w:val="1C1C1C"/>
+          <w:lang w:val="de-DE"/>
+        </w:rPr>
+        <w:t>ifen.</w:t>
+      </w:r>
+    </w:p>
+    <w:p>
+      <w:pPr>
+        <w:pStyle w:val="a7"/>
+        <w:divId w:val="1275867849"/>
+        <w:rPr>
+          <w:rFonts w:ascii="Segoe UI" w:hAnsi="Segoe UI" w:cs="Segoe UI"/>
+          <w:color w:val="1C1C1C"/>
+          <w:lang w:val="de-DE"/>
+        </w:rPr>
+      </w:pPr>
+      <w:r>
+        <w:rPr>
+          <w:rFonts w:ascii="Segoe UI" w:hAnsi="Segoe UI" w:cs="Segoe UI"/>
+          <w:color w:val="1C1C1C"/>
+          <w:lang w:val="de-DE"/>
+        </w:rPr>
+        <w:t>7-10 Jahre (obere Grundschulklassen): genaue Abstände und Winkel, Arithmetik, Geometrie der Figuren, Zeichnen mit dem Filzstift.</w:t>
+      </w:r>
+    </w:p>
+    <w:p>
+      <w:pPr>
+        <w:pStyle w:val="a7"/>
+        <w:divId w:val="1275867849"/>
+        <w:rPr>
+          <w:rFonts w:ascii="Segoe UI" w:hAnsi="Segoe UI" w:cs="Segoe UI"/>
+          <w:color w:val="1C1C1C"/>
+          <w:lang w:val="de-DE"/>
+        </w:rPr>
+      </w:pPr>
+      <w:r>
+        <w:rPr>
+          <w:rFonts w:ascii="Segoe UI" w:hAnsi="Segoe UI" w:cs="Segoe UI"/>
+          <w:color w:val="1C1C1C"/>
+          <w:lang w:val="de-DE"/>
+        </w:rPr>
+        <w:t>Ab 10: derselbe Roboter lässt sich aus Scratch programmieren.</w:t>
+      </w:r>
+    </w:p>
+    <w:p>
+      <w:pPr>
+        <w:pStyle w:val="3"/>
+        <w:divId w:val="1275867849"/>
+        <w:rPr>
+          <w:rFonts w:ascii="Segoe UI" w:eastAsia="Times New Roman" w:hAnsi="Segoe UI" w:cs="Segoe UI"/>
+          <w:lang w:val="de-DE"/>
+        </w:rPr>
+      </w:pPr>
+      <w:r>
+        <w:rPr>
+          <w:rFonts w:ascii="Segoe UI" w:eastAsia="Times New Roman" w:hAnsi="Segoe UI" w:cs="Segoe UI"/>
+          <w:lang w:val="de-DE"/>
+        </w:rPr>
+        <w:t>Bereits im Einsatz</w:t>
+      </w:r>
+    </w:p>
+    <w:p>
+      <w:pPr>
+        <w:pStyle w:val="a7"/>
+        <w:divId w:val="1275867849"/>
+        <w:rPr>
+          <w:rFonts w:ascii="Segoe UI" w:hAnsi="Segoe UI" w:cs="Segoe UI"/>
+          <w:color w:val="1C1C1C"/>
+          <w:lang w:val="de-DE"/>
+        </w:rPr>
+      </w:pPr>
+      <w:r>
+        <w:rPr>
+          <w:rFonts w:ascii="Segoe UI" w:hAnsi="Segoe UI" w:cs="Segoe UI"/>
+          <w:color w:val="1C1C1C"/>
+          <w:lang w:val="de-DE"/>
+        </w:rPr>
+        <w:t>Terra Numerica, das französische Zentrum</w:t>
+      </w:r>
+      <w:r>
+        <w:rPr>
+          <w:rFonts w:ascii="Segoe UI" w:hAnsi="Segoe UI" w:cs="Segoe UI"/>
+          <w:color w:val="1C1C1C"/>
+          <w:lang w:val="de-DE"/>
+        </w:rPr>
+        <w:t xml:space="preserve"> für Wissenschaftsvermittlung (Sophia Antipolis; ein Projekt von CNRS, Inria und Université Côte d'Azur), setzt PrimaSTEM bereits in seinen Veranstaltungen ein.</w:t>
+      </w:r>
+    </w:p>
+    <w:p>
+      <w:pPr>
+        <w:pStyle w:val="a7"/>
+        <w:divId w:val="1275867849"/>
+        <w:rPr>
+          <w:rFonts w:ascii="Segoe UI" w:hAnsi="Segoe UI" w:cs="Segoe UI"/>
+          <w:color w:val="1C1C1C"/>
+          <w:lang w:val="de-DE"/>
+        </w:rPr>
+      </w:pPr>
+      <w:r>
+        <w:rPr>
+          <w:rFonts w:ascii="Segoe UI" w:hAnsi="Segoe UI" w:cs="Segoe UI"/>
+          <w:color w:val="1C1C1C"/>
+          <w:lang w:val="de-DE"/>
+        </w:rPr>
+        <w:t>Ohne Bildschirm. Hergestellt in Frankreich (Cannes), zertifiziert nach CE und UKCA.</w:t>
+      </w:r>
+    </w:p>
+    <w:p>
+      <w:pPr>
+        <w:pStyle w:val="note"/>
+        <w:divId w:val="1275867849"/>
+        <w:rPr>
+          <w:rFonts w:ascii="Segoe UI" w:hAnsi="Segoe UI" w:cs="Segoe UI"/>
+          <w:lang w:val="de-DE"/>
+        </w:rPr>
+      </w:pPr>
       <w:r>
         <w:rPr>
           <w:rStyle w:val="a5"/>
@@ -311,319 +614,8 @@
           <w:iCs/>
           <w:lang w:val="de-DE"/>
         </w:rPr>
-        <w:t>sets/photos/02-robot-sur-quadrillage.jpg, Roboter auf dem Raster]</w:t>
-      </w:r>
-    </w:p>
-    <w:p>
-      <w:pPr>
-        <w:pStyle w:val="3"/>
-        <w:divId w:val="525214978"/>
-        <w:rPr>
-          <w:rFonts w:ascii="Segoe UI" w:eastAsia="Times New Roman" w:hAnsi="Segoe UI" w:cs="Segoe UI"/>
-          <w:lang w:val="de-DE"/>
-        </w:rPr>
-      </w:pPr>
-      <w:r>
-        <w:rPr>
-          <w:rFonts w:ascii="Segoe UI" w:eastAsia="Times New Roman" w:hAnsi="Segoe UI" w:cs="Segoe UI"/>
-          <w:lang w:val="de-DE"/>
-        </w:rPr>
-        <w:t>Methodik und Unterrichtsentwürfe sind bereits dabei</w:t>
-      </w:r>
-    </w:p>
-    <w:p>
-      <w:pPr>
-        <w:pStyle w:val="a7"/>
-        <w:divId w:val="525214978"/>
-        <w:rPr>
-          <w:rFonts w:ascii="Segoe UI" w:hAnsi="Segoe UI" w:cs="Segoe UI"/>
-          <w:color w:val="1C1C1C"/>
-          <w:lang w:val="de-DE"/>
-        </w:rPr>
-      </w:pPr>
-      <w:r>
-        <w:rPr>
-          <w:rFonts w:ascii="Segoe UI" w:hAnsi="Segoe UI" w:cs="Segoe UI"/>
-          <w:color w:val="1C1C1C"/>
-          <w:lang w:val="de-DE"/>
-        </w:rPr>
-        <w:t>Ein fertiger Kurs führt vom ersten Programm über Funktionen, Schleifen, Abstände und Winkel bis hin zur Arithmetik. Eigens für die Jüngere</w:t>
-      </w:r>
-      <w:r>
-        <w:rPr>
-          <w:rFonts w:ascii="Segoe UI" w:hAnsi="Segoe UI" w:cs="Segoe UI"/>
-          <w:color w:val="1C1C1C"/>
-          <w:lang w:val="de-DE"/>
-        </w:rPr>
-        <w:t>n von 4-8 Jahren gibt es einen Einführungskurs aus 12 Einheiten. Alles ist in der Dokumentation offen einsehbar, schon vor der Bestellung. Ein Set für eine Gruppe von 2-4 Kindern: Roboter, Holzkonsole und Befehlskarten aus Pappe. Das Programm bauen die Kin</w:t>
-      </w:r>
-      <w:r>
-        <w:rPr>
-          <w:rFonts w:ascii="Segoe UI" w:hAnsi="Segoe UI" w:cs="Segoe UI"/>
-          <w:color w:val="1C1C1C"/>
-          <w:lang w:val="de-DE"/>
-        </w:rPr>
-        <w:t>der mit den Händen direkt auf der Konsole zusammen.</w:t>
-      </w:r>
-    </w:p>
-    <w:p>
-      <w:pPr>
-        <w:pStyle w:val="3"/>
-        <w:divId w:val="525214978"/>
-        <w:rPr>
-          <w:rFonts w:ascii="Segoe UI" w:eastAsia="Times New Roman" w:hAnsi="Segoe UI" w:cs="Segoe UI"/>
-          <w:lang w:val="de-DE"/>
-        </w:rPr>
-      </w:pPr>
-      <w:r>
-        <w:rPr>
-          <w:rFonts w:ascii="Segoe UI" w:eastAsia="Times New Roman" w:hAnsi="Segoe UI" w:cs="Segoe UI"/>
-          <w:lang w:val="de-DE"/>
-        </w:rPr>
-        <w:t>Den Fehler findet das Kind selbst</w:t>
-      </w:r>
-    </w:p>
-    <w:p>
-      <w:pPr>
-        <w:pStyle w:val="a7"/>
-        <w:divId w:val="525214978"/>
-        <w:rPr>
-          <w:rFonts w:ascii="Segoe UI" w:hAnsi="Segoe UI" w:cs="Segoe UI"/>
-          <w:color w:val="1C1C1C"/>
-          <w:lang w:val="de-DE"/>
-        </w:rPr>
-      </w:pPr>
-      <w:r>
-        <w:rPr>
-          <w:rFonts w:ascii="Segoe UI" w:hAnsi="Segoe UI" w:cs="Segoe UI"/>
-          <w:color w:val="1C1C1C"/>
-          <w:lang w:val="de-DE"/>
-        </w:rPr>
-        <w:t>Das Programm bleibt auf der Konsole, vor den Augen des Kindes. Fährt der Roboter in die falsche Richtung oder wird die Linie krumm, findet das Kind selbst den falschen Sc</w:t>
-      </w:r>
-      <w:r>
-        <w:rPr>
-          <w:rFonts w:ascii="Segoe UI" w:hAnsi="Segoe UI" w:cs="Segoe UI"/>
-          <w:color w:val="1C1C1C"/>
-          <w:lang w:val="de-DE"/>
-        </w:rPr>
-        <w:t>hritt, ändert einen Teil des Programms und versucht es erneut. Mit dem Filzstift ist das noch anschaulicher: Der Fehler ist sofort auf dem Papier zu sehen.</w:t>
-      </w:r>
-    </w:p>
-    <w:p>
-      <w:pPr>
-        <w:pStyle w:val="3"/>
-        <w:divId w:val="525214978"/>
-        <w:rPr>
-          <w:rFonts w:ascii="Segoe UI" w:eastAsia="Times New Roman" w:hAnsi="Segoe UI" w:cs="Segoe UI"/>
-          <w:lang w:val="de-DE"/>
-        </w:rPr>
-      </w:pPr>
-      <w:r>
-        <w:rPr>
-          <w:rFonts w:ascii="Segoe UI" w:eastAsia="Times New Roman" w:hAnsi="Segoe UI" w:cs="Segoe UI"/>
-          <w:lang w:val="de-DE"/>
-        </w:rPr>
-        <w:t>Buchstaben, Wörter und Musik</w:t>
-      </w:r>
-    </w:p>
-    <w:p>
-      <w:pPr>
-        <w:pStyle w:val="a7"/>
-        <w:divId w:val="525214978"/>
-        <w:rPr>
-          <w:rFonts w:ascii="Segoe UI" w:hAnsi="Segoe UI" w:cs="Segoe UI"/>
-          <w:color w:val="1C1C1C"/>
-          <w:lang w:val="de-DE"/>
-        </w:rPr>
-      </w:pPr>
-      <w:r>
-        <w:rPr>
-          <w:rFonts w:ascii="Segoe UI" w:hAnsi="Segoe UI" w:cs="Segoe UI"/>
-          <w:color w:val="1C1C1C"/>
-          <w:lang w:val="de-DE"/>
-        </w:rPr>
-        <w:t>Der Roboter spricht jeden Schritt und jeden Befehl mit Stimme aus, in d</w:t>
-      </w:r>
-      <w:r>
-        <w:rPr>
-          <w:rFonts w:ascii="Segoe UI" w:hAnsi="Segoe UI" w:cs="Segoe UI"/>
-          <w:color w:val="1C1C1C"/>
-          <w:lang w:val="de-DE"/>
-        </w:rPr>
-        <w:t>er von Ihnen gewählten Sprache. Die Sprachausgabe ist in mehr als 17 Sprachen verfügbar. Er fährt auf eine Karte mit einem Wort und spricht es aus. Insgesamt rund 90 Wörter: Haus, Wald, Kino. Er nennt die Buchstaben des Alphabets, spielt Noten ab und spric</w:t>
-      </w:r>
-      <w:r>
-        <w:rPr>
-          <w:rFonts w:ascii="Segoe UI" w:hAnsi="Segoe UI" w:cs="Segoe UI"/>
-          <w:color w:val="1C1C1C"/>
-          <w:lang w:val="de-DE"/>
-        </w:rPr>
-        <w:t>ht Rechenaufgaben vor. Derselbe Roboter, der das Programmieren und Rechnen lehrt, macht nebenbei mit Sprache und Musik vertraut.</w:t>
-      </w:r>
-    </w:p>
-    <w:p>
-      <w:pPr>
-        <w:pStyle w:val="3"/>
-        <w:divId w:val="525214978"/>
-        <w:rPr>
-          <w:rFonts w:ascii="Segoe UI" w:eastAsia="Times New Roman" w:hAnsi="Segoe UI" w:cs="Segoe UI"/>
-          <w:lang w:val="de-DE"/>
-        </w:rPr>
-      </w:pPr>
-      <w:r>
-        <w:rPr>
-          <w:rFonts w:ascii="Segoe UI" w:eastAsia="Times New Roman" w:hAnsi="Segoe UI" w:cs="Segoe UI"/>
-          <w:lang w:val="de-DE"/>
-        </w:rPr>
-        <w:t>Von 4 bis 10 Jahren, ein Roboter</w:t>
-      </w:r>
-    </w:p>
-    <w:p>
-      <w:pPr>
-        <w:pStyle w:val="a7"/>
-        <w:divId w:val="525214978"/>
-        <w:rPr>
-          <w:rFonts w:ascii="Segoe UI" w:hAnsi="Segoe UI" w:cs="Segoe UI"/>
-          <w:color w:val="1C1C1C"/>
-          <w:lang w:val="de-DE"/>
-        </w:rPr>
-      </w:pPr>
-      <w:r>
-        <w:rPr>
-          <w:rFonts w:ascii="Segoe UI" w:hAnsi="Segoe UI" w:cs="Segoe UI"/>
-          <w:color w:val="1C1C1C"/>
-          <w:lang w:val="de-DE"/>
-        </w:rPr>
-        <w:t>4-7 Jahre (untere Grundschulklassen): Bewegungen und Drehungen, Labyrinthe, Abfolgen, Schleife</w:t>
-      </w:r>
-      <w:r>
-        <w:rPr>
-          <w:rFonts w:ascii="Segoe UI" w:hAnsi="Segoe UI" w:cs="Segoe UI"/>
-          <w:color w:val="1C1C1C"/>
-          <w:lang w:val="de-DE"/>
-        </w:rPr>
-        <w:t>n.</w:t>
-      </w:r>
-    </w:p>
-    <w:p>
-      <w:pPr>
-        <w:pStyle w:val="a7"/>
-        <w:divId w:val="525214978"/>
-        <w:rPr>
-          <w:rFonts w:ascii="Segoe UI" w:hAnsi="Segoe UI" w:cs="Segoe UI"/>
-          <w:color w:val="1C1C1C"/>
-          <w:lang w:val="de-DE"/>
-        </w:rPr>
-      </w:pPr>
-      <w:r>
-        <w:rPr>
-          <w:rFonts w:ascii="Segoe UI" w:hAnsi="Segoe UI" w:cs="Segoe UI"/>
-          <w:color w:val="1C1C1C"/>
-          <w:lang w:val="de-DE"/>
-        </w:rPr>
-        <w:t>7-10 Jahre (obere Grundschulklassen): genaue Abstände und Winkel, Arithmetik, Geometrie der Figuren, Zeichnen mit dem Filzstift.</w:t>
-      </w:r>
-    </w:p>
-    <w:p>
-      <w:pPr>
-        <w:pStyle w:val="3"/>
-        <w:divId w:val="525214978"/>
-        <w:rPr>
-          <w:rFonts w:ascii="Segoe UI" w:eastAsia="Times New Roman" w:hAnsi="Segoe UI" w:cs="Segoe UI"/>
-          <w:lang w:val="de-DE"/>
-        </w:rPr>
-      </w:pPr>
-      <w:r>
-        <w:rPr>
-          <w:rFonts w:ascii="Segoe UI" w:eastAsia="Times New Roman" w:hAnsi="Segoe UI" w:cs="Segoe UI"/>
-          <w:lang w:val="de-DE"/>
-        </w:rPr>
-        <w:t>Bereits im Einsatz</w:t>
-      </w:r>
-    </w:p>
-    <w:p>
-      <w:pPr>
-        <w:pStyle w:val="a7"/>
-        <w:divId w:val="525214978"/>
-        <w:rPr>
-          <w:rFonts w:ascii="Segoe UI" w:hAnsi="Segoe UI" w:cs="Segoe UI"/>
-          <w:color w:val="1C1C1C"/>
-          <w:lang w:val="de-DE"/>
-        </w:rPr>
-      </w:pPr>
-      <w:r>
-        <w:rPr>
-          <w:rFonts w:ascii="Segoe UI" w:hAnsi="Segoe UI" w:cs="Segoe UI"/>
-          <w:color w:val="1C1C1C"/>
-          <w:lang w:val="de-DE"/>
-        </w:rPr>
-        <w:t xml:space="preserve">Terra Numerica, das französische Zentrum für Wissenschaftsvermittlung (Sophia Antipolis; ein Projekt von </w:t>
-      </w:r>
-      <w:r>
-        <w:rPr>
-          <w:rFonts w:ascii="Segoe UI" w:hAnsi="Segoe UI" w:cs="Segoe UI"/>
-          <w:color w:val="1C1C1C"/>
-          <w:lang w:val="de-DE"/>
-        </w:rPr>
-        <w:t>CNRS, Inria und Université Côte d'Azur), setzt PrimaSTEM bereits in seinen Veranstaltungen ein.</w:t>
-      </w:r>
-    </w:p>
-    <w:p>
-      <w:pPr>
-        <w:pStyle w:val="a7"/>
-        <w:divId w:val="525214978"/>
-        <w:rPr>
-          <w:rFonts w:ascii="Segoe UI" w:hAnsi="Segoe UI" w:cs="Segoe UI"/>
-          <w:color w:val="1C1C1C"/>
-          <w:lang w:val="de-DE"/>
-        </w:rPr>
-      </w:pPr>
-      <w:r>
-        <w:rPr>
-          <w:rFonts w:ascii="Segoe UI" w:hAnsi="Segoe UI" w:cs="Segoe UI"/>
-          <w:color w:val="1C1C1C"/>
-          <w:lang w:val="de-DE"/>
-        </w:rPr>
-        <w:t>Ohne Bildschirm. Hergestellt in Frankreich (Cannes), zertifiziert nach CE und UKCA.</w:t>
-      </w:r>
-    </w:p>
-    <w:p>
-      <w:pPr>
-        <w:pStyle w:val="a7"/>
-        <w:divId w:val="525214978"/>
-        <w:rPr>
-          <w:rFonts w:ascii="Segoe UI" w:hAnsi="Segoe UI" w:cs="Segoe UI"/>
-          <w:color w:val="1C1C1C"/>
-          <w:lang w:val="de-DE"/>
-        </w:rPr>
-      </w:pPr>
-      <w:r>
-        <w:rPr>
-          <w:rFonts w:ascii="Segoe UI" w:hAnsi="Segoe UI" w:cs="Segoe UI"/>
-          <w:color w:val="1C1C1C"/>
-          <w:lang w:val="de-DE"/>
-        </w:rPr>
-        <w:t>Empfohlener Preis für Frankreich: 297 € HT. Mathematik, Geometrie, Zeichnen,</w:t>
-      </w:r>
-      <w:r>
-        <w:rPr>
-          <w:rFonts w:ascii="Segoe UI" w:hAnsi="Segoe UI" w:cs="Segoe UI"/>
-          <w:color w:val="1C1C1C"/>
-          <w:lang w:val="de-DE"/>
-        </w:rPr>
-        <w:t xml:space="preserve"> Sprachausgabe und Methodik sind darin bereits enthalten, ohne separate Aufpreise. Eine einzige Anschaffung reicht für alle Jahre von 4 bis 10.</w:t>
-      </w:r>
-    </w:p>
-    <w:p>
-      <w:pPr>
-        <w:pStyle w:val="note"/>
-        <w:divId w:val="525214978"/>
-        <w:rPr>
-          <w:rFonts w:ascii="Segoe UI" w:hAnsi="Segoe UI" w:cs="Segoe UI"/>
-          <w:lang w:val="de-DE"/>
-        </w:rPr>
-      </w:pPr>
+        <w:t>Den Preis l</w:t>
+      </w:r>
       <w:r>
         <w:rPr>
           <w:rStyle w:val="a5"/>
@@ -632,40 +624,32 @@
           <w:iCs/>
           <w:lang w:val="de-DE"/>
         </w:rPr>
-        <w:t>Den endgültigen Preis legt der Distributor fest.</w:t>
-      </w:r>
-    </w:p>
-    <w:p>
-      <w:pPr>
-        <w:pStyle w:val="a7"/>
-        <w:divId w:val="525214978"/>
-        <w:rPr>
-          <w:rFonts w:ascii="Segoe UI" w:hAnsi="Segoe UI" w:cs="Segoe UI"/>
-          <w:color w:val="1C1C1C"/>
-          <w:lang w:val="de-DE"/>
-        </w:rPr>
-      </w:pPr>
-      <w:r>
-        <w:rPr>
-          <w:rFonts w:ascii="Segoe UI" w:hAnsi="Segoe UI" w:cs="Segoe UI"/>
-          <w:color w:val="1C1C1C"/>
-          <w:lang w:val="de-DE"/>
-        </w:rPr>
-        <w:t>Testen Sie den Roboter vor dem Kauf. Er läuft direkt im Browser</w:t>
-      </w:r>
-      <w:r>
-        <w:rPr>
-          <w:rFonts w:ascii="Segoe UI" w:hAnsi="Segoe UI" w:cs="Segoe UI"/>
-          <w:color w:val="1C1C1C"/>
-          <w:lang w:val="de-DE"/>
-        </w:rPr>
-        <w:t>. Öffnen Sie den Link oder richten Sie die Kamera auf den QR-Code:</w:t>
-      </w:r>
-    </w:p>
-    <w:p>
-      <w:pPr>
-        <w:pStyle w:val="a7"/>
-        <w:divId w:val="525214978"/>
+        <w:t>egt der Distributor fest.</w:t>
+      </w:r>
+    </w:p>
+    <w:p>
+      <w:pPr>
+        <w:pStyle w:val="a7"/>
+        <w:divId w:val="1275867849"/>
+        <w:rPr>
+          <w:rFonts w:ascii="Segoe UI" w:hAnsi="Segoe UI" w:cs="Segoe UI"/>
+          <w:color w:val="1C1C1C"/>
+          <w:lang w:val="de-DE"/>
+        </w:rPr>
+      </w:pPr>
+      <w:r>
+        <w:rPr>
+          <w:rFonts w:ascii="Segoe UI" w:hAnsi="Segoe UI" w:cs="Segoe UI"/>
+          <w:color w:val="1C1C1C"/>
+          <w:lang w:val="de-DE"/>
+        </w:rPr>
+        <w:t>Testen Sie den Roboter vor dem Kauf. Er läuft direkt im Browser. Öffnen Sie den Link oder richten Sie die Kamera auf den QR-Code:</w:t>
+      </w:r>
+    </w:p>
+    <w:p>
+      <w:pPr>
+        <w:pStyle w:val="a7"/>
+        <w:divId w:val="1275867849"/>
         <w:rPr>
           <w:rFonts w:ascii="Segoe UI" w:hAnsi="Segoe UI" w:cs="Segoe UI"/>
           <w:color w:val="1C1C1C"/>
@@ -684,7 +668,7 @@
     <w:p>
       <w:pPr>
         <w:pStyle w:val="note"/>
-        <w:divId w:val="525214978"/>
+        <w:divId w:val="1275867849"/>
         <w:rPr>
           <w:rFonts w:ascii="Segoe UI" w:hAnsi="Segoe UI" w:cs="Segoe UI"/>
           <w:lang w:val="de-DE"/>
@@ -704,7 +688,7 @@
     <w:p>
       <w:pPr>
         <w:pStyle w:val="note"/>
-        <w:divId w:val="525214978"/>
+        <w:divId w:val="1275867849"/>
         <w:rPr>
           <w:rFonts w:ascii="Segoe UI" w:hAnsi="Segoe UI" w:cs="Segoe UI"/>
           <w:lang w:val="de-DE"/>
@@ -724,7 +708,7 @@
     <w:p>
       <w:pPr>
         <w:pStyle w:val="a7"/>
-        <w:divId w:val="525214978"/>
+        <w:divId w:val="1275867849"/>
         <w:rPr>
           <w:rFonts w:ascii="Segoe UI" w:hAnsi="Segoe UI" w:cs="Segoe UI"/>
           <w:color w:val="1C1C1C"/>
@@ -743,7 +727,7 @@
     <w:p>
       <w:pPr>
         <w:pStyle w:val="a7"/>
-        <w:divId w:val="525214978"/>
+        <w:divId w:val="1275867849"/>
         <w:rPr>
           <w:rFonts w:ascii="Segoe UI" w:hAnsi="Segoe UI" w:cs="Segoe UI"/>
           <w:color w:val="1C1C1C"/>
@@ -778,7 +762,7 @@
     <w:p>
       <w:pPr>
         <w:pStyle w:val="a7"/>
-        <w:divId w:val="525214978"/>
+        <w:divId w:val="1275867849"/>
         <w:rPr>
           <w:rFonts w:ascii="Segoe UI" w:hAnsi="Segoe UI" w:cs="Segoe UI"/>
           <w:color w:val="1C1C1C"/>
@@ -797,7 +781,7 @@
     <w:p>
       <w:pPr>
         <w:pStyle w:val="note"/>
-        <w:divId w:val="525214978"/>
+        <w:divId w:val="1275867849"/>
         <w:rPr>
           <w:rFonts w:ascii="Segoe UI" w:hAnsi="Segoe UI" w:cs="Segoe UI"/>
           <w:lang w:val="de-DE"/>
@@ -827,7 +811,7 @@
     <w:p>
       <w:pPr>
         <w:pStyle w:val="note"/>
-        <w:divId w:val="525214978"/>
+        <w:divId w:val="1275867849"/>
         <w:rPr>
           <w:rFonts w:ascii="Segoe UI" w:hAnsi="Segoe UI" w:cs="Segoe UI"/>
           <w:lang w:val="de-DE"/>

</xml_diff>